<commit_message>
DOCS: Mise à jours du document SCRUM
Le document SCRUM a été mis à jours selon la réunion du 02/04/2026.
</commit_message>
<xml_diff>
--- a/DossierConception/DocumentSCRUM.docx
+++ b/DossierConception/DocumentSCRUM.docx
@@ -411,7 +411,7 @@
         <w:rPr>
           <w:rtl w:val="0"/>
         </w:rPr>
-        <w:t xml:space="preserve">Architecture: MVC (Modèle Vue Contrôleur)</w:t>
+        <w:t xml:space="preserve">Architecture: MVC (Modèle Vue Contrôleur côté Web) et Web Service (côté API)</w:t>
       </w:r>
     </w:p>
     <w:p>
@@ -462,7 +462,7 @@
         <w:rPr>
           <w:rtl w:val="0"/>
         </w:rPr>
-        <w:t xml:space="preserve">Jakarta EE</w:t>
+        <w:t xml:space="preserve">Spring Boot</w:t>
       </w:r>
     </w:p>
     <w:p>
@@ -472,12 +472,15 @@
           <w:numId w:val="6"/>
         </w:numPr>
         <w:ind w:left="1440" w:hanging="360"/>
-      </w:pPr>
-      <w:r>
-        <w:rPr>
-          <w:rtl w:val="0"/>
-        </w:rPr>
-        <w:t xml:space="preserve">Spring Boot</w:t>
+        <w:rPr>
+          <w:u w:val="none"/>
+        </w:rPr>
+      </w:pPr>
+      <w:r>
+        <w:rPr>
+          <w:rtl w:val="0"/>
+        </w:rPr>
+        <w:t xml:space="preserve">Selenium</w:t>
       </w:r>
     </w:p>
     <w:p>
@@ -487,15 +490,12 @@
           <w:numId w:val="6"/>
         </w:numPr>
         <w:ind w:left="1440" w:hanging="360"/>
-        <w:rPr>
-          <w:u w:val="none"/>
-        </w:rPr>
-      </w:pPr>
-      <w:r>
-        <w:rPr>
-          <w:rtl w:val="0"/>
-        </w:rPr>
-        <w:t xml:space="preserve">Selenium</w:t>
+      </w:pPr>
+      <w:r>
+        <w:rPr>
+          <w:rtl w:val="0"/>
+        </w:rPr>
+        <w:t xml:space="preserve">MySQL 8.4</w:t>
       </w:r>
     </w:p>
     <w:p>
@@ -510,7 +510,7 @@
         <w:rPr>
           <w:rtl w:val="0"/>
         </w:rPr>
-        <w:t xml:space="preserve">MySQL 8.4</w:t>
+        <w:t xml:space="preserve">Hibernate</w:t>
       </w:r>
     </w:p>
     <w:p>
@@ -520,12 +520,33 @@
           <w:numId w:val="6"/>
         </w:numPr>
         <w:ind w:left="1440" w:hanging="360"/>
-      </w:pPr>
-      <w:r>
-        <w:rPr>
-          <w:rtl w:val="0"/>
-        </w:rPr>
-        <w:t xml:space="preserve">Hibernate</w:t>
+        <w:rPr>
+          <w:u w:val="none"/>
+        </w:rPr>
+      </w:pPr>
+      <w:r>
+        <w:rPr>
+          <w:rtl w:val="0"/>
+        </w:rPr>
+        <w:t xml:space="preserve">Maven</w:t>
+      </w:r>
+    </w:p>
+    <w:p>
+      <w:pPr>
+        <w:numPr>
+          <w:ilvl w:val="0"/>
+          <w:numId w:val="6"/>
+        </w:numPr>
+        <w:ind w:left="720" w:hanging="360"/>
+        <w:rPr>
+          <w:u w:val="none"/>
+        </w:rPr>
+      </w:pPr>
+      <w:r>
+        <w:rPr>
+          <w:rtl w:val="0"/>
+        </w:rPr>
+        <w:t xml:space="preserve">Front:</w:t>
       </w:r>
     </w:p>
     <w:p>
@@ -543,7 +564,7 @@
         <w:rPr>
           <w:rtl w:val="0"/>
         </w:rPr>
-        <w:t xml:space="preserve">Maven</w:t>
+        <w:t xml:space="preserve">HTML5</w:t>
       </w:r>
     </w:p>
     <w:p>
@@ -553,30 +574,15 @@
           <w:numId w:val="6"/>
         </w:numPr>
         <w:ind w:left="1440" w:hanging="360"/>
-      </w:pPr>
-      <w:r>
-        <w:rPr>
-          <w:rtl w:val="0"/>
-        </w:rPr>
-        <w:t xml:space="preserve">TomCat 10</w:t>
-      </w:r>
-    </w:p>
-    <w:p>
-      <w:pPr>
-        <w:numPr>
-          <w:ilvl w:val="0"/>
-          <w:numId w:val="6"/>
-        </w:numPr>
-        <w:ind w:left="720" w:hanging="360"/>
-        <w:rPr>
-          <w:u w:val="none"/>
-        </w:rPr>
-      </w:pPr>
-      <w:r>
-        <w:rPr>
-          <w:rtl w:val="0"/>
-        </w:rPr>
-        <w:t xml:space="preserve">Front:</w:t>
+        <w:rPr>
+          <w:u w:val="none"/>
+        </w:rPr>
+      </w:pPr>
+      <w:r>
+        <w:rPr>
+          <w:rtl w:val="0"/>
+        </w:rPr>
+        <w:t xml:space="preserve">CSS3</w:t>
       </w:r>
     </w:p>
     <w:p>
@@ -594,7 +600,7 @@
         <w:rPr>
           <w:rtl w:val="0"/>
         </w:rPr>
-        <w:t xml:space="preserve">HTML5</w:t>
+        <w:t xml:space="preserve">JavaScript</w:t>
       </w:r>
     </w:p>
     <w:p>
@@ -612,7 +618,7 @@
         <w:rPr>
           <w:rtl w:val="0"/>
         </w:rPr>
-        <w:t xml:space="preserve">CSS3</w:t>
+        <w:t xml:space="preserve">BootStrap 5.3.8</w:t>
       </w:r>
     </w:p>
     <w:p>
@@ -630,7 +636,25 @@
         <w:rPr>
           <w:rtl w:val="0"/>
         </w:rPr>
-        <w:t xml:space="preserve">JavaScript</w:t>
+        <w:t xml:space="preserve">NPM</w:t>
+      </w:r>
+    </w:p>
+    <w:p>
+      <w:pPr>
+        <w:numPr>
+          <w:ilvl w:val="0"/>
+          <w:numId w:val="6"/>
+        </w:numPr>
+        <w:ind w:left="720" w:hanging="360"/>
+        <w:rPr>
+          <w:u w:val="none"/>
+        </w:rPr>
+      </w:pPr>
+      <w:r>
+        <w:rPr>
+          <w:rtl w:val="0"/>
+        </w:rPr>
+        <w:t xml:space="preserve">Outils:</w:t>
       </w:r>
     </w:p>
     <w:p>
@@ -648,7 +672,7 @@
         <w:rPr>
           <w:rtl w:val="0"/>
         </w:rPr>
-        <w:t xml:space="preserve">BootStrap 5.3.8</w:t>
+        <w:t xml:space="preserve">Intellij</w:t>
       </w:r>
     </w:p>
     <w:p>
@@ -666,60 +690,6 @@
         <w:rPr>
           <w:rtl w:val="0"/>
         </w:rPr>
-        <w:t xml:space="preserve">NPM</w:t>
-      </w:r>
-    </w:p>
-    <w:p>
-      <w:pPr>
-        <w:numPr>
-          <w:ilvl w:val="0"/>
-          <w:numId w:val="6"/>
-        </w:numPr>
-        <w:ind w:left="720" w:hanging="360"/>
-        <w:rPr>
-          <w:u w:val="none"/>
-        </w:rPr>
-      </w:pPr>
-      <w:r>
-        <w:rPr>
-          <w:rtl w:val="0"/>
-        </w:rPr>
-        <w:t xml:space="preserve">Outils:</w:t>
-      </w:r>
-    </w:p>
-    <w:p>
-      <w:pPr>
-        <w:numPr>
-          <w:ilvl w:val="1"/>
-          <w:numId w:val="6"/>
-        </w:numPr>
-        <w:ind w:left="1440" w:hanging="360"/>
-        <w:rPr>
-          <w:u w:val="none"/>
-        </w:rPr>
-      </w:pPr>
-      <w:r>
-        <w:rPr>
-          <w:rtl w:val="0"/>
-        </w:rPr>
-        <w:t xml:space="preserve">Intellij</w:t>
-      </w:r>
-    </w:p>
-    <w:p>
-      <w:pPr>
-        <w:numPr>
-          <w:ilvl w:val="1"/>
-          <w:numId w:val="6"/>
-        </w:numPr>
-        <w:ind w:left="1440" w:hanging="360"/>
-        <w:rPr>
-          <w:u w:val="none"/>
-        </w:rPr>
-      </w:pPr>
-      <w:r>
-        <w:rPr>
-          <w:rtl w:val="0"/>
-        </w:rPr>
         <w:t xml:space="preserve">WampServer</w:t>
       </w:r>
     </w:p>
@@ -1102,7 +1072,25 @@
         <w:rPr>
           <w:rtl w:val="0"/>
         </w:rPr>
-        <w:t xml:space="preserve">Accès BDD (DAO): repositories</w:t>
+        <w:t xml:space="preserve">Accès BDD (ORM Hibernate): repositories</w:t>
+      </w:r>
+    </w:p>
+    <w:p>
+      <w:pPr>
+        <w:numPr>
+          <w:ilvl w:val="0"/>
+          <w:numId w:val="7"/>
+        </w:numPr>
+        <w:ind w:left="720" w:hanging="360"/>
+        <w:rPr>
+          <w:u w:val="none"/>
+        </w:rPr>
+      </w:pPr>
+      <w:r>
+        <w:rPr>
+          <w:rtl w:val="0"/>
+        </w:rPr>
+        <w:t xml:space="preserve">Services: services</w:t>
       </w:r>
     </w:p>
     <w:p>

</xml_diff>

<commit_message>
DOCS: Mise à jour du dossier de conception
Retrait du type "HTML" de la partie dédiées aux commits.
</commit_message>
<xml_diff>
--- a/DossierConception/DocumentSCRUM.docx
+++ b/DossierConception/DocumentSCRUM.docx
@@ -795,13 +795,19 @@
         <w:rPr>
           <w:lang w:val="fr-FR"/>
         </w:rPr>
-        <w:t> : modification de style</w:t>
-      </w:r>
-      <w:r>
-        <w:rPr>
-          <w:lang w:val="fr-FR"/>
-        </w:rPr>
-        <w:t xml:space="preserve"> (CSS,</w:t>
+        <w:t> : modification de styl</w:t>
+      </w:r>
+      <w:r>
+        <w:rPr>
+          <w:lang w:val="fr-FR"/>
+        </w:rPr>
+        <w:t>e</w:t>
+      </w:r>
+      <w:r>
+        <w:rPr>
+          <w:lang w:val="fr-FR"/>
+        </w:rPr>
+        <w:t>,</w:t>
       </w:r>
       <w:r>
         <w:rPr>
@@ -832,19 +838,19 @@
           <w:bCs/>
           <w:lang w:val="fr-FR"/>
         </w:rPr>
-        <w:t>HTML</w:t>
-      </w:r>
-      <w:r>
-        <w:rPr>
-          <w:lang w:val="fr-FR"/>
-        </w:rPr>
-        <w:t xml:space="preserve"> : </w:t>
-      </w:r>
-      <w:r>
-        <w:rPr>
-          <w:lang w:val="fr-FR"/>
-        </w:rPr>
-        <w:t>ajout/mise à jour de page(s) HTML.</w:t>
+        <w:t xml:space="preserve">IMG </w:t>
+      </w:r>
+      <w:r>
+        <w:rPr>
+          <w:lang w:val="fr-FR"/>
+        </w:rPr>
+        <w:t xml:space="preserve">: </w:t>
+      </w:r>
+      <w:r>
+        <w:rPr>
+          <w:lang w:val="fr-FR"/>
+        </w:rPr>
+        <w:t>ajout/mise à jour de ressources visuelles.</w:t>
       </w:r>
     </w:p>
     <w:p>
@@ -864,19 +870,19 @@
           <w:lang w:val="fr-FR"/>
         </w:rPr>
         <w:lastRenderedPageBreak/>
-        <w:t xml:space="preserve">IMG </w:t>
-      </w:r>
-      <w:r>
-        <w:rPr>
-          <w:lang w:val="fr-FR"/>
-        </w:rPr>
-        <w:t xml:space="preserve">: </w:t>
-      </w:r>
-      <w:r>
-        <w:rPr>
-          <w:lang w:val="fr-FR"/>
-        </w:rPr>
-        <w:t>ajout/mise à jour de ressources visuelles.</w:t>
+        <w:t>REFACTOR</w:t>
+      </w:r>
+      <w:r>
+        <w:rPr>
+          <w:lang w:val="fr-FR"/>
+        </w:rPr>
+        <w:t> : modification des sources n’étant ni un correctif, ni un ajout de fonctionnalité</w:t>
+      </w:r>
+      <w:r>
+        <w:rPr>
+          <w:lang w:val="fr-FR"/>
+        </w:rPr>
+        <w:t>.</w:t>
       </w:r>
     </w:p>
     <w:p>
@@ -895,13 +901,13 @@
           <w:bCs/>
           <w:lang w:val="fr-FR"/>
         </w:rPr>
-        <w:t>REFACTOR</w:t>
-      </w:r>
-      <w:r>
-        <w:rPr>
-          <w:lang w:val="fr-FR"/>
-        </w:rPr>
-        <w:t> : modification des sources n’étant ni un correctif, ni un ajout de fonctionnalité</w:t>
+        <w:t>PERF</w:t>
+      </w:r>
+      <w:r>
+        <w:rPr>
+          <w:lang w:val="fr-FR"/>
+        </w:rPr>
+        <w:t> : amélioration de la performance</w:t>
       </w:r>
       <w:r>
         <w:rPr>
@@ -926,13 +932,13 @@
           <w:bCs/>
           <w:lang w:val="fr-FR"/>
         </w:rPr>
-        <w:t>PERF</w:t>
-      </w:r>
-      <w:r>
-        <w:rPr>
-          <w:lang w:val="fr-FR"/>
-        </w:rPr>
-        <w:t> : amélioration de la performance</w:t>
+        <w:t>TEST</w:t>
+      </w:r>
+      <w:r>
+        <w:rPr>
+          <w:lang w:val="fr-FR"/>
+        </w:rPr>
+        <w:t> : ajout ou correction de test</w:t>
       </w:r>
       <w:r>
         <w:rPr>
@@ -957,13 +963,27 @@
           <w:bCs/>
           <w:lang w:val="fr-FR"/>
         </w:rPr>
-        <w:t>TEST</w:t>
-      </w:r>
-      <w:r>
-        <w:rPr>
-          <w:lang w:val="fr-FR"/>
-        </w:rPr>
-        <w:t> : ajout ou correction de test</w:t>
+        <w:t>BUILD</w:t>
+      </w:r>
+      <w:r>
+        <w:rPr>
+          <w:lang w:val="fr-FR"/>
+        </w:rPr>
+        <w:t> : modification affectant le “</w:t>
+      </w:r>
+      <w:r>
+        <w:rPr>
+          <w:i/>
+          <w:iCs/>
+          <w:lang w:val="fr-FR"/>
+        </w:rPr>
+        <w:t>build</w:t>
+      </w:r>
+      <w:r>
+        <w:rPr>
+          <w:lang w:val="fr-FR"/>
+        </w:rPr>
+        <w:t>” ou les dépendances externes (exemples de contextes : webpack, broccoli, npm)</w:t>
       </w:r>
       <w:r>
         <w:rPr>
@@ -988,27 +1008,13 @@
           <w:bCs/>
           <w:lang w:val="fr-FR"/>
         </w:rPr>
-        <w:t>BUILD</w:t>
-      </w:r>
-      <w:r>
-        <w:rPr>
-          <w:lang w:val="fr-FR"/>
-        </w:rPr>
-        <w:t> : modification affectant le “</w:t>
-      </w:r>
-      <w:r>
-        <w:rPr>
-          <w:i/>
-          <w:iCs/>
-          <w:lang w:val="fr-FR"/>
-        </w:rPr>
-        <w:t>build</w:t>
-      </w:r>
-      <w:r>
-        <w:rPr>
-          <w:lang w:val="fr-FR"/>
-        </w:rPr>
-        <w:t>” ou les dépendances externes (exemples de contextes : webpack, broccoli, npm)</w:t>
+        <w:t>CHORE</w:t>
+      </w:r>
+      <w:r>
+        <w:rPr>
+          <w:lang w:val="fr-FR"/>
+        </w:rPr>
+        <w:t> : autres mises à jour ne modifiant ni les sources, ni les tests</w:t>
       </w:r>
       <w:r>
         <w:rPr>
@@ -1033,13 +1039,13 @@
           <w:bCs/>
           <w:lang w:val="fr-FR"/>
         </w:rPr>
-        <w:t>CHORE</w:t>
-      </w:r>
-      <w:r>
-        <w:rPr>
-          <w:lang w:val="fr-FR"/>
-        </w:rPr>
-        <w:t> : autres mises à jour ne modifiant ni les sources, ni les tests</w:t>
+        <w:t>CI</w:t>
+      </w:r>
+      <w:r>
+        <w:rPr>
+          <w:lang w:val="fr-FR"/>
+        </w:rPr>
+        <w:t> : modification de la configuration ou des scripts liés à la CI (Travis, Circle, BrowserStack, SauceLabs, etc.)</w:t>
       </w:r>
       <w:r>
         <w:rPr>
@@ -1049,37 +1055,6 @@
       </w:r>
     </w:p>
     <w:p>
-      <w:pPr>
-        <w:numPr>
-          <w:ilvl w:val="0"/>
-          <w:numId w:val="8"/>
-        </w:numPr>
-        <w:rPr>
-          <w:lang w:val="fr-FR"/>
-        </w:rPr>
-      </w:pPr>
-      <w:r>
-        <w:rPr>
-          <w:b/>
-          <w:bCs/>
-          <w:lang w:val="fr-FR"/>
-        </w:rPr>
-        <w:t>CI</w:t>
-      </w:r>
-      <w:r>
-        <w:rPr>
-          <w:lang w:val="fr-FR"/>
-        </w:rPr>
-        <w:t> : modification de la configuration ou des scripts liés à la CI (Travis, Circle, BrowserStack, SauceLabs, etc.)</w:t>
-      </w:r>
-      <w:r>
-        <w:rPr>
-          <w:lang w:val="fr-FR"/>
-        </w:rPr>
-        <w:t>.</w:t>
-      </w:r>
-    </w:p>
-    <w:p>
       <w:r>
         <w:t>Un commit se présente sous la forme : TYPECOMMIT: Nom du commit</w:t>
       </w:r>
@@ -1103,6 +1078,9 @@
     </w:p>
     <w:p>
       <w:r>
+        <w:rPr>
+          <w:noProof/>
+        </w:rPr>
         <w:drawing>
           <wp:inline distT="0" distB="0" distL="0" distR="0" wp14:anchorId="1723CC29" wp14:editId="535C012F">
             <wp:extent cx="4363059" cy="1886213"/>
@@ -1140,6 +1118,16 @@
         </w:drawing>
       </w:r>
     </w:p>
+    <w:p>
+      <w:r>
+        <w:t>Dans des cas plus précis : TYPECOMMIT(domaineConcerné): Nom du commit</w:t>
+      </w:r>
+    </w:p>
+    <w:p>
+      <w:r>
+        <w:t>Exemple : REFACTOR(Java): Nettoyage variables inutiles</w:t>
+      </w:r>
+    </w:p>
     <w:p/>
     <w:p>
       <w:pPr>
@@ -1319,12 +1307,12 @@
     </w:p>
     <w:p>
       <w:r>
+        <w:lastRenderedPageBreak/>
         <w:t>Diagramme de Use Case.</w:t>
       </w:r>
     </w:p>
     <w:p>
       <w:r>
-        <w:lastRenderedPageBreak/>
         <w:t>CSS.</w:t>
       </w:r>
     </w:p>
@@ -2843,6 +2831,7 @@
   <w:style w:type="character" w:default="1" w:styleId="Policepardfaut">
     <w:name w:val="Default Paragraph Font"/>
     <w:uiPriority w:val="1"/>
+    <w:semiHidden/>
     <w:unhideWhenUsed/>
   </w:style>
   <w:style w:type="table" w:default="1" w:styleId="TableauNormal">

</xml_diff>